<commit_message>
docs(report): add confirmed SNS evidence
</commit_message>
<xml_diff>
--- a/output/final/Pacific-BioArchive-Team-Report.docx
+++ b/output/final/Pacific-BioArchive-Team-Report.docx
@@ -619,7 +619,7 @@
           <w:rFonts w:ascii="Arial" w:hAnsi="Arial"/>
           <w:sz w:val="24"/>
         </w:rPr>
-        <w:t>Live cloud validation was completed on 29 August 2026 after deploying the latest main API and Worker Lambda images and disabling the fallback member3-worker trigger. Two image smoke runs passed through Cognito sign-in, deployed frontend upload, S3/SQS/Lambda/GCP inference, tag query, thumbnail reverse query, delete, 404 after deletion, sign-out, and zero DynamoDB residue. A separate 3 second MP4 smoke run passed with video/mp4, the expected alectura_lathami tag, tag query, delete, 404 after deletion, and zero DLQ messages.</w:t>
+        <w:t>Live cloud validation was completed on 29 August 2026 after deploying the latest main API and Worker Lambda images and disabling the fallback member3-worker trigger. Two image smoke runs passed through Cognito sign-in, deployed frontend upload, S3/SQS/Lambda/GCP inference, tag query, thumbnail reverse query, delete, 404 after deletion, sign-out, and zero DynamoDB residue. A separate 3 second MP4 smoke run passed with video/mp4, the expected alectura_lathami tag, tag query, delete, 404 after deletion, and zero DLQ messages. The Member 4 SNS email subscription was confirmed on 30 August 2026 and rechecked by AWS CLI with a concrete subscription ARN.</w:t>
       </w:r>
     </w:p>
     <w:p>
@@ -690,7 +690,7 @@
         <w:widowControl/>
       </w:pPr>
       <w:r>
-        <w:t>Use Notifications to subscribe/unsubscribe to species tag email updates, then confirm the SNS email if demonstrating notifications.</w:t>
+        <w:t>Use Notifications to subscribe/unsubscribe to species tag email updates. For the submitted evidence, the Member 4 mailbox SNS subscription has already been confirmed.</w:t>
       </w:r>
     </w:p>
     <w:p>

</xml_diff>